<commit_message>
backend part last 2
</commit_message>
<xml_diff>
--- a/next steps.docx
+++ b/next steps.docx
@@ -114,6 +114,9 @@
       <w:r>
         <w:t xml:space="preserve"> (Name) </w:t>
       </w:r>
+      <w:r>
+        <w:t xml:space="preserve">also teacher can create student role should also create the parent role </w:t>
+      </w:r>
     </w:p>
     <w:p>
       <w:proofErr w:type="gramStart"/>
@@ -447,15 +450,16 @@
       <w:r>
         <w:t>Teacher fill attendance</w:t>
       </w:r>
-    </w:p>
-    <w:p>
-      <w:proofErr w:type="gramStart"/>
-      <w:r>
-        <w:t>Student ,</w:t>
-      </w:r>
-      <w:proofErr w:type="gramEnd"/>
-      <w:r>
-        <w:t xml:space="preserve"> parents view own attendance, teacher view class attendance, teacher can download monthly attendance sheet in pdf format</w:t>
+      <w:r>
+        <w:t xml:space="preserve"> </w:t>
+      </w:r>
+      <w:proofErr w:type="spellStart"/>
+      <w:r>
+        <w:t>attendance</w:t>
+      </w:r>
+      <w:proofErr w:type="spellEnd"/>
+      <w:r>
+        <w:t xml:space="preserve"> sheet in pdf format</w:t>
       </w:r>
       <w:r>
         <w:t>:</w:t>
@@ -484,7 +488,7 @@
                     </pic:cNvPicPr>
                   </pic:nvPicPr>
                   <pic:blipFill>
-                    <a:blip r:embed="rId4" cstate="print">
+                    <a:blip r:embed="rId5" cstate="print">
                       <a:extLst>
                         <a:ext uri="{28A0092B-C50C-407E-A947-70E740481C1C}">
                           <a14:useLocalDpi xmlns:a14="http://schemas.microsoft.com/office/drawing/2010/main" val="0"/>
@@ -521,29 +525,6 @@
         <w:t xml:space="preserve">Tables on first and last page should be blank all other details should be filled </w:t>
       </w:r>
     </w:p>
-    <w:p/>
-    <w:p>
-      <w:r>
-        <w:lastRenderedPageBreak/>
-        <w:t xml:space="preserve">QUIZ MODULE </w:t>
-      </w:r>
-    </w:p>
-    <w:p>
-      <w:r>
-        <w:t>Teacher can add questions and publish quizzes</w:t>
-      </w:r>
-    </w:p>
-    <w:p>
-      <w:r>
-        <w:t xml:space="preserve">Students can see and take quizzes on submission view marks </w:t>
-      </w:r>
-    </w:p>
-    <w:p>
-      <w:r>
-        <w:t xml:space="preserve">Teachers can view marks of all the student in the class </w:t>
-      </w:r>
-    </w:p>
-    <w:p/>
     <w:p>
       <w:r>
         <w:t>REPORT CARD MODULE</w:t>
@@ -551,33 +532,8 @@
     </w:p>
     <w:p>
       <w:r>
-        <w:t>Teachers can generate printable report cards</w:t>
-      </w:r>
-      <w:r>
-        <w:t xml:space="preserve"> of each individual </w:t>
-      </w:r>
-      <w:proofErr w:type="gramStart"/>
-      <w:r>
-        <w:t xml:space="preserve">student </w:t>
-      </w:r>
-      <w:r>
-        <w:t xml:space="preserve"> format</w:t>
-      </w:r>
-      <w:proofErr w:type="gramEnd"/>
-      <w:r>
-        <w:t xml:space="preserve"> is as given below </w:t>
-      </w:r>
-      <w:r>
-        <w:t xml:space="preserve">inputs should be fields in the below mentioned </w:t>
-      </w:r>
-      <w:r>
-        <w:t xml:space="preserve">report card, the student details are already in the database as they should be taken during adding new </w:t>
-      </w:r>
-      <w:proofErr w:type="gramStart"/>
-      <w:r>
-        <w:t>student .</w:t>
-      </w:r>
-      <w:proofErr w:type="gramEnd"/>
+        <w:t>Printable report card format</w:t>
+      </w:r>
     </w:p>
     <w:p>
       <w:pPr>
@@ -589,6 +545,7 @@
         <w:rPr>
           <w:noProof/>
         </w:rPr>
+        <w:lastRenderedPageBreak/>
         <w:drawing>
           <wp:inline distT="0" distB="0" distL="0" distR="0" wp14:anchorId="43672126" wp14:editId="75D0531E">
             <wp:extent cx="2499177" cy="1874520"/>
@@ -605,7 +562,7 @@
                     <pic:cNvPicPr/>
                   </pic:nvPicPr>
                   <pic:blipFill>
-                    <a:blip r:embed="rId5" cstate="print">
+                    <a:blip r:embed="rId6" cstate="print">
                       <a:extLst>
                         <a:ext uri="{28A0092B-C50C-407E-A947-70E740481C1C}">
                           <a14:useLocalDpi xmlns:a14="http://schemas.microsoft.com/office/drawing/2010/main" val="0"/>
@@ -651,7 +608,7 @@
                     <pic:cNvPicPr/>
                   </pic:nvPicPr>
                   <pic:blipFill>
-                    <a:blip r:embed="rId6" cstate="print">
+                    <a:blip r:embed="rId7" cstate="print">
                       <a:extLst>
                         <a:ext uri="{28A0092B-C50C-407E-A947-70E740481C1C}">
                           <a14:useLocalDpi xmlns:a14="http://schemas.microsoft.com/office/drawing/2010/main" val="0"/>
@@ -682,32 +639,671 @@
       </w:r>
     </w:p>
     <w:p/>
-    <w:p>
-      <w:r>
-        <w:t xml:space="preserve">MEETINGS MODULE </w:t>
-      </w:r>
-    </w:p>
-    <w:p>
-      <w:r>
-        <w:t xml:space="preserve">Teachers should be able to schedule meetings </w:t>
-      </w:r>
-      <w:proofErr w:type="spellStart"/>
-      <w:r>
-        <w:t>ptms</w:t>
-      </w:r>
-      <w:proofErr w:type="spellEnd"/>
-    </w:p>
-    <w:p>
-      <w:r>
-        <w:t>Parents should get notify about the upcoming meetings and view their meeting schedule</w:t>
-      </w:r>
-    </w:p>
-    <w:p>
-      <w:r>
-        <w:t>Teachers should be able to cancel or reschedule</w:t>
-      </w:r>
-    </w:p>
     <w:p/>
+    <w:p/>
+    <w:p/>
+    <w:p>
+      <w:pPr>
+        <w:numPr>
+          <w:ilvl w:val="0"/>
+          <w:numId w:val="1"/>
+        </w:numPr>
+      </w:pPr>
+      <w:r>
+        <w:rPr>
+          <w:b/>
+          <w:bCs/>
+        </w:rPr>
+        <w:t>School Profile:</w:t>
+      </w:r>
+      <w:r>
+        <w:t> "</w:t>
+      </w:r>
+      <w:proofErr w:type="spellStart"/>
+      <w:r>
+        <w:rPr>
+          <w:rFonts w:ascii="Nirmala UI" w:hAnsi="Nirmala UI" w:cs="Nirmala UI"/>
+        </w:rPr>
+        <w:t>वैनतेय</w:t>
+      </w:r>
+      <w:proofErr w:type="spellEnd"/>
+      <w:r>
+        <w:t xml:space="preserve"> </w:t>
+      </w:r>
+      <w:proofErr w:type="spellStart"/>
+      <w:r>
+        <w:rPr>
+          <w:rFonts w:ascii="Nirmala UI" w:hAnsi="Nirmala UI" w:cs="Nirmala UI"/>
+        </w:rPr>
+        <w:t>प्राथमिक</w:t>
+      </w:r>
+      <w:proofErr w:type="spellEnd"/>
+      <w:r>
+        <w:t xml:space="preserve"> </w:t>
+      </w:r>
+      <w:proofErr w:type="spellStart"/>
+      <w:r>
+        <w:rPr>
+          <w:rFonts w:ascii="Nirmala UI" w:hAnsi="Nirmala UI" w:cs="Nirmala UI"/>
+        </w:rPr>
+        <w:t>विद्या</w:t>
+      </w:r>
+      <w:proofErr w:type="spellEnd"/>
+      <w:r>
+        <w:t xml:space="preserve"> </w:t>
+      </w:r>
+      <w:proofErr w:type="spellStart"/>
+      <w:r>
+        <w:rPr>
+          <w:rFonts w:ascii="Nirmala UI" w:hAnsi="Nirmala UI" w:cs="Nirmala UI"/>
+        </w:rPr>
+        <w:t>मंदिर</w:t>
+      </w:r>
+      <w:proofErr w:type="spellEnd"/>
+      <w:r>
+        <w:t>" (</w:t>
+      </w:r>
+      <w:proofErr w:type="spellStart"/>
+      <w:r>
+        <w:t>Vainateya</w:t>
+      </w:r>
+      <w:proofErr w:type="spellEnd"/>
+      <w:r>
+        <w:t xml:space="preserve"> </w:t>
+      </w:r>
+      <w:proofErr w:type="spellStart"/>
+      <w:r>
+        <w:t>Prathamik</w:t>
+      </w:r>
+      <w:proofErr w:type="spellEnd"/>
+      <w:r>
+        <w:t xml:space="preserve"> Vidya Mandir).</w:t>
+      </w:r>
+    </w:p>
+    <w:p>
+      <w:pPr>
+        <w:numPr>
+          <w:ilvl w:val="0"/>
+          <w:numId w:val="1"/>
+        </w:numPr>
+      </w:pPr>
+      <w:r>
+        <w:rPr>
+          <w:b/>
+          <w:bCs/>
+        </w:rPr>
+        <w:t>Short Name:</w:t>
+      </w:r>
+      <w:r>
+        <w:t> </w:t>
+      </w:r>
+      <w:proofErr w:type="spellStart"/>
+      <w:r>
+        <w:rPr>
+          <w:rFonts w:ascii="Nirmala UI" w:hAnsi="Nirmala UI" w:cs="Nirmala UI"/>
+        </w:rPr>
+        <w:t>वैनतेय</w:t>
+      </w:r>
+      <w:proofErr w:type="spellEnd"/>
+    </w:p>
+    <w:p>
+      <w:pPr>
+        <w:numPr>
+          <w:ilvl w:val="0"/>
+          <w:numId w:val="1"/>
+        </w:numPr>
+      </w:pPr>
+      <w:r>
+        <w:rPr>
+          <w:b/>
+          <w:bCs/>
+        </w:rPr>
+        <w:t>Tagline:</w:t>
+      </w:r>
+      <w:r>
+        <w:t> </w:t>
+      </w:r>
+      <w:proofErr w:type="spellStart"/>
+      <w:r>
+        <w:rPr>
+          <w:rFonts w:ascii="Nirmala UI" w:hAnsi="Nirmala UI" w:cs="Nirmala UI"/>
+        </w:rPr>
+        <w:t>निफाड</w:t>
+      </w:r>
+      <w:proofErr w:type="spellEnd"/>
+      <w:r>
+        <w:t xml:space="preserve">, </w:t>
+      </w:r>
+      <w:proofErr w:type="spellStart"/>
+      <w:r>
+        <w:rPr>
+          <w:rFonts w:ascii="Nirmala UI" w:hAnsi="Nirmala UI" w:cs="Nirmala UI"/>
+        </w:rPr>
+        <w:t>नाशिक</w:t>
+      </w:r>
+      <w:proofErr w:type="spellEnd"/>
+      <w:r>
+        <w:t xml:space="preserve"> (Niphad, Nashik)</w:t>
+      </w:r>
+    </w:p>
+    <w:p>
+      <w:pPr>
+        <w:numPr>
+          <w:ilvl w:val="0"/>
+          <w:numId w:val="1"/>
+        </w:numPr>
+      </w:pPr>
+      <w:r>
+        <w:rPr>
+          <w:b/>
+          <w:bCs/>
+        </w:rPr>
+        <w:t>Address:</w:t>
+      </w:r>
+      <w:r>
+        <w:t> </w:t>
+      </w:r>
+      <w:proofErr w:type="spellStart"/>
+      <w:r>
+        <w:rPr>
+          <w:rFonts w:ascii="Nirmala UI" w:hAnsi="Nirmala UI" w:cs="Nirmala UI"/>
+        </w:rPr>
+        <w:t>वैनतेय</w:t>
+      </w:r>
+      <w:proofErr w:type="spellEnd"/>
+      <w:r>
+        <w:t xml:space="preserve"> </w:t>
+      </w:r>
+      <w:proofErr w:type="spellStart"/>
+      <w:r>
+        <w:rPr>
+          <w:rFonts w:ascii="Nirmala UI" w:hAnsi="Nirmala UI" w:cs="Nirmala UI"/>
+        </w:rPr>
+        <w:t>प्राथमिक</w:t>
+      </w:r>
+      <w:proofErr w:type="spellEnd"/>
+      <w:r>
+        <w:t xml:space="preserve"> </w:t>
+      </w:r>
+      <w:proofErr w:type="spellStart"/>
+      <w:r>
+        <w:rPr>
+          <w:rFonts w:ascii="Nirmala UI" w:hAnsi="Nirmala UI" w:cs="Nirmala UI"/>
+        </w:rPr>
+        <w:t>विद्या</w:t>
+      </w:r>
+      <w:proofErr w:type="spellEnd"/>
+      <w:r>
+        <w:t xml:space="preserve"> </w:t>
+      </w:r>
+      <w:proofErr w:type="spellStart"/>
+      <w:r>
+        <w:rPr>
+          <w:rFonts w:ascii="Nirmala UI" w:hAnsi="Nirmala UI" w:cs="Nirmala UI"/>
+        </w:rPr>
+        <w:t>मंदिर</w:t>
+      </w:r>
+      <w:proofErr w:type="spellEnd"/>
+      <w:r>
+        <w:t xml:space="preserve">, </w:t>
+      </w:r>
+      <w:proofErr w:type="spellStart"/>
+      <w:r>
+        <w:rPr>
+          <w:rFonts w:ascii="Nirmala UI" w:hAnsi="Nirmala UI" w:cs="Nirmala UI"/>
+        </w:rPr>
+        <w:t>निफाड</w:t>
+      </w:r>
+      <w:proofErr w:type="spellEnd"/>
+      <w:r>
+        <w:t xml:space="preserve">, </w:t>
+      </w:r>
+      <w:proofErr w:type="spellStart"/>
+      <w:r>
+        <w:rPr>
+          <w:rFonts w:ascii="Nirmala UI" w:hAnsi="Nirmala UI" w:cs="Nirmala UI"/>
+        </w:rPr>
+        <w:t>ता</w:t>
+      </w:r>
+      <w:proofErr w:type="spellEnd"/>
+      <w:r>
+        <w:t xml:space="preserve">. </w:t>
+      </w:r>
+      <w:proofErr w:type="spellStart"/>
+      <w:r>
+        <w:rPr>
+          <w:rFonts w:ascii="Nirmala UI" w:hAnsi="Nirmala UI" w:cs="Nirmala UI"/>
+        </w:rPr>
+        <w:t>निफाड</w:t>
+      </w:r>
+      <w:proofErr w:type="spellEnd"/>
+      <w:r>
+        <w:t xml:space="preserve">, </w:t>
+      </w:r>
+      <w:proofErr w:type="spellStart"/>
+      <w:r>
+        <w:rPr>
+          <w:rFonts w:ascii="Nirmala UI" w:hAnsi="Nirmala UI" w:cs="Nirmala UI"/>
+        </w:rPr>
+        <w:t>जि</w:t>
+      </w:r>
+      <w:proofErr w:type="spellEnd"/>
+      <w:r>
+        <w:t xml:space="preserve">. </w:t>
+      </w:r>
+      <w:proofErr w:type="spellStart"/>
+      <w:r>
+        <w:rPr>
+          <w:rFonts w:ascii="Nirmala UI" w:hAnsi="Nirmala UI" w:cs="Nirmala UI"/>
+        </w:rPr>
+        <w:t>नाशिक</w:t>
+      </w:r>
+      <w:proofErr w:type="spellEnd"/>
+      <w:r>
+        <w:t xml:space="preserve"> — 422303</w:t>
+      </w:r>
+    </w:p>
+    <w:p>
+      <w:pPr>
+        <w:numPr>
+          <w:ilvl w:val="0"/>
+          <w:numId w:val="1"/>
+        </w:numPr>
+      </w:pPr>
+      <w:r>
+        <w:rPr>
+          <w:b/>
+          <w:bCs/>
+        </w:rPr>
+        <w:t>Trustee Line:</w:t>
+      </w:r>
+      <w:r>
+        <w:t> </w:t>
+      </w:r>
+      <w:proofErr w:type="spellStart"/>
+      <w:r>
+        <w:rPr>
+          <w:rFonts w:ascii="Nirmala UI" w:hAnsi="Nirmala UI" w:cs="Nirmala UI"/>
+        </w:rPr>
+        <w:t>न्या</w:t>
+      </w:r>
+      <w:proofErr w:type="spellEnd"/>
+      <w:r>
+        <w:t xml:space="preserve">. </w:t>
+      </w:r>
+      <w:proofErr w:type="spellStart"/>
+      <w:r>
+        <w:rPr>
+          <w:rFonts w:ascii="Nirmala UI" w:hAnsi="Nirmala UI" w:cs="Nirmala UI"/>
+        </w:rPr>
+        <w:t>रानडे</w:t>
+      </w:r>
+      <w:proofErr w:type="spellEnd"/>
+      <w:r>
+        <w:t xml:space="preserve"> </w:t>
+      </w:r>
+      <w:proofErr w:type="spellStart"/>
+      <w:r>
+        <w:rPr>
+          <w:rFonts w:ascii="Nirmala UI" w:hAnsi="Nirmala UI" w:cs="Nirmala UI"/>
+        </w:rPr>
+        <w:t>विद्याप्रसारक</w:t>
+      </w:r>
+      <w:proofErr w:type="spellEnd"/>
+      <w:r>
+        <w:t xml:space="preserve"> </w:t>
+      </w:r>
+      <w:proofErr w:type="spellStart"/>
+      <w:r>
+        <w:rPr>
+          <w:rFonts w:ascii="Nirmala UI" w:hAnsi="Nirmala UI" w:cs="Nirmala UI"/>
+        </w:rPr>
+        <w:t>मंडळ</w:t>
+      </w:r>
+      <w:proofErr w:type="spellEnd"/>
+      <w:r>
+        <w:t xml:space="preserve"> </w:t>
+      </w:r>
+      <w:proofErr w:type="spellStart"/>
+      <w:r>
+        <w:rPr>
+          <w:rFonts w:ascii="Nirmala UI" w:hAnsi="Nirmala UI" w:cs="Nirmala UI"/>
+        </w:rPr>
+        <w:t>संचालित</w:t>
+      </w:r>
+      <w:proofErr w:type="spellEnd"/>
+      <w:r>
+        <w:t xml:space="preserve"> (Run by Nya. Ranade </w:t>
+      </w:r>
+      <w:proofErr w:type="spellStart"/>
+      <w:r>
+        <w:t>Vidyaprasarak</w:t>
+      </w:r>
+      <w:proofErr w:type="spellEnd"/>
+      <w:r>
+        <w:t xml:space="preserve"> Mandal).</w:t>
+      </w:r>
+    </w:p>
+    <w:p>
+      <w:pPr>
+        <w:numPr>
+          <w:ilvl w:val="0"/>
+          <w:numId w:val="1"/>
+        </w:numPr>
+      </w:pPr>
+      <w:r>
+        <w:rPr>
+          <w:b/>
+          <w:bCs/>
+        </w:rPr>
+        <w:t>Offered Grades:</w:t>
+      </w:r>
+      <w:r>
+        <w:t> </w:t>
+      </w:r>
+      <w:proofErr w:type="spellStart"/>
+      <w:r>
+        <w:rPr>
+          <w:rFonts w:ascii="Nirmala UI" w:hAnsi="Nirmala UI" w:cs="Nirmala UI"/>
+        </w:rPr>
+        <w:t>इयत्ता</w:t>
+      </w:r>
+      <w:proofErr w:type="spellEnd"/>
+      <w:r>
+        <w:t xml:space="preserve"> </w:t>
+      </w:r>
+      <w:r>
+        <w:rPr>
+          <w:rFonts w:ascii="Nirmala UI" w:hAnsi="Nirmala UI" w:cs="Nirmala UI"/>
+        </w:rPr>
+        <w:t>१</w:t>
+      </w:r>
+      <w:r>
+        <w:t xml:space="preserve"> </w:t>
+      </w:r>
+      <w:proofErr w:type="spellStart"/>
+      <w:r>
+        <w:rPr>
+          <w:rFonts w:ascii="Nirmala UI" w:hAnsi="Nirmala UI" w:cs="Nirmala UI"/>
+        </w:rPr>
+        <w:t>ली</w:t>
+      </w:r>
+      <w:proofErr w:type="spellEnd"/>
+      <w:r>
+        <w:t xml:space="preserve"> </w:t>
+      </w:r>
+      <w:proofErr w:type="spellStart"/>
+      <w:r>
+        <w:rPr>
+          <w:rFonts w:ascii="Nirmala UI" w:hAnsi="Nirmala UI" w:cs="Nirmala UI"/>
+        </w:rPr>
+        <w:t>ते</w:t>
+      </w:r>
+      <w:proofErr w:type="spellEnd"/>
+      <w:r>
+        <w:t xml:space="preserve"> </w:t>
+      </w:r>
+      <w:r>
+        <w:rPr>
+          <w:rFonts w:ascii="Nirmala UI" w:hAnsi="Nirmala UI" w:cs="Nirmala UI"/>
+        </w:rPr>
+        <w:t>४</w:t>
+      </w:r>
+      <w:r>
+        <w:t xml:space="preserve"> </w:t>
+      </w:r>
+      <w:proofErr w:type="spellStart"/>
+      <w:r>
+        <w:rPr>
+          <w:rFonts w:ascii="Nirmala UI" w:hAnsi="Nirmala UI" w:cs="Nirmala UI"/>
+        </w:rPr>
+        <w:t>थी</w:t>
+      </w:r>
+      <w:proofErr w:type="spellEnd"/>
+      <w:r>
+        <w:t xml:space="preserve"> (Classes 1st to 4th Standard).</w:t>
+      </w:r>
+    </w:p>
+    <w:p>
+      <w:pPr>
+        <w:numPr>
+          <w:ilvl w:val="0"/>
+          <w:numId w:val="1"/>
+        </w:numPr>
+      </w:pPr>
+      <w:r>
+        <w:rPr>
+          <w:b/>
+          <w:bCs/>
+        </w:rPr>
+        <w:t>Contact Number:</w:t>
+      </w:r>
+      <w:r>
+        <w:t> +</w:t>
+      </w:r>
+      <w:r>
+        <w:rPr>
+          <w:rFonts w:ascii="Nirmala UI" w:hAnsi="Nirmala UI" w:cs="Nirmala UI"/>
+        </w:rPr>
+        <w:t>९१</w:t>
+      </w:r>
+      <w:r>
+        <w:t xml:space="preserve"> </w:t>
+      </w:r>
+      <w:r>
+        <w:rPr>
+          <w:rFonts w:ascii="Nirmala UI" w:hAnsi="Nirmala UI" w:cs="Nirmala UI"/>
+        </w:rPr>
+        <w:t>२२</w:t>
+      </w:r>
+      <w:r>
+        <w:t xml:space="preserve"> </w:t>
+      </w:r>
+      <w:r>
+        <w:rPr>
+          <w:rFonts w:ascii="Nirmala UI" w:hAnsi="Nirmala UI" w:cs="Nirmala UI"/>
+        </w:rPr>
+        <w:t>२३५६</w:t>
+      </w:r>
+      <w:r>
+        <w:t xml:space="preserve"> </w:t>
+      </w:r>
+      <w:r>
+        <w:rPr>
+          <w:rFonts w:ascii="Nirmala UI" w:hAnsi="Nirmala UI" w:cs="Nirmala UI"/>
+        </w:rPr>
+        <w:t>६८९०</w:t>
+      </w:r>
+      <w:r>
+        <w:t xml:space="preserve"> (Tel format: +91 22 2356 6890)</w:t>
+      </w:r>
+    </w:p>
+    <w:p>
+      <w:pPr>
+        <w:numPr>
+          <w:ilvl w:val="0"/>
+          <w:numId w:val="1"/>
+        </w:numPr>
+      </w:pPr>
+      <w:r>
+        <w:rPr>
+          <w:b/>
+          <w:bCs/>
+        </w:rPr>
+        <w:t>General Email:</w:t>
+      </w:r>
+      <w:r>
+        <w:t> </w:t>
+      </w:r>
+    </w:p>
+    <w:p>
+      <w:r>
+        <mc:AlternateContent>
+          <mc:Choice Requires="wps">
+            <w:drawing>
+              <wp:inline distT="0" distB="0" distL="0" distR="0" wp14:anchorId="74E11EBB" wp14:editId="3A7B3A37">
+                <wp:extent cx="304800" cy="304800"/>
+                <wp:effectExtent l="0" t="0" r="0" b="0"/>
+                <wp:docPr id="1134732983" name="Rectangle 7"/>
+                <wp:cNvGraphicFramePr>
+                  <a:graphicFrameLocks xmlns:a="http://schemas.openxmlformats.org/drawingml/2006/main" noChangeAspect="1"/>
+                </wp:cNvGraphicFramePr>
+                <a:graphic xmlns:a="http://schemas.openxmlformats.org/drawingml/2006/main">
+                  <a:graphicData uri="http://schemas.microsoft.com/office/word/2010/wordprocessingShape">
+                    <wps:wsp>
+                      <wps:cNvSpPr>
+                        <a:spLocks noChangeAspect="1" noChangeArrowheads="1"/>
+                      </wps:cNvSpPr>
+                      <wps:spPr bwMode="auto">
+                        <a:xfrm>
+                          <a:off x="0" y="0"/>
+                          <a:ext cx="304800" cy="304800"/>
+                        </a:xfrm>
+                        <a:prstGeom prst="rect">
+                          <a:avLst/>
+                        </a:prstGeom>
+                        <a:noFill/>
+                        <a:ln>
+                          <a:noFill/>
+                        </a:ln>
+                        <a:extLst>
+                          <a:ext uri="{909E8E84-426E-40DD-AFC4-6F175D3DCCD1}">
+                            <a14:hiddenFill xmlns:a14="http://schemas.microsoft.com/office/drawing/2010/main">
+                              <a:solidFill>
+                                <a:srgbClr val="FFFFFF"/>
+                              </a:solidFill>
+                            </a14:hiddenFill>
+                          </a:ext>
+                          <a:ext uri="{91240B29-F687-4F45-9708-019B960494DF}">
+                            <a14:hiddenLine xmlns:a14="http://schemas.microsoft.com/office/drawing/2010/main" w="9525">
+                              <a:solidFill>
+                                <a:srgbClr val="000000"/>
+                              </a:solidFill>
+                              <a:miter lim="800000"/>
+                              <a:headEnd/>
+                              <a:tailEnd/>
+                            </a14:hiddenLine>
+                          </a:ext>
+                        </a:extLst>
+                      </wps:spPr>
+                      <wps:bodyPr rot="0" vert="horz" wrap="square" lIns="91440" tIns="45720" rIns="91440" bIns="45720" anchor="t" anchorCtr="0" upright="1">
+                        <a:noAutofit/>
+                      </wps:bodyPr>
+                    </wps:wsp>
+                  </a:graphicData>
+                </a:graphic>
+              </wp:inline>
+            </w:drawing>
+          </mc:Choice>
+          <mc:Fallback>
+            <w:pict>
+              <v:rect w14:anchorId="5EF8B3E8" id="Rectangle 7" o:spid="_x0000_s1026" style="width:24pt;height:24pt;visibility:visible;mso-wrap-style:square;mso-left-percent:-10001;mso-top-percent:-10001;mso-position-horizontal:absolute;mso-position-horizontal-relative:char;mso-position-vertical:absolute;mso-position-vertical-relative:line;mso-left-percent:-10001;mso-top-percent:-10001;v-text-anchor:top" o:gfxdata="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" filled="f" stroked="f">
+                <o:lock v:ext="edit" aspectratio="t"/>
+                <w10:anchorlock/>
+              </v:rect>
+            </w:pict>
+          </mc:Fallback>
+        </mc:AlternateContent>
+      </w:r>
+    </w:p>
+    <w:p>
+      <w:r>
+        <w:t>info@vainateya.edu</w:t>
+      </w:r>
+    </w:p>
+    <w:p>
+      <w:pPr>
+        <w:numPr>
+          <w:ilvl w:val="0"/>
+          <w:numId w:val="1"/>
+        </w:numPr>
+      </w:pPr>
+      <w:r>
+        <w:rPr>
+          <w:b/>
+          <w:bCs/>
+        </w:rPr>
+        <w:t>Admissions Email:</w:t>
+      </w:r>
+      <w:r>
+        <w:t> </w:t>
+      </w:r>
+    </w:p>
+    <w:p>
+      <w:r>
+        <mc:AlternateContent>
+          <mc:Choice Requires="wps">
+            <w:drawing>
+              <wp:inline distT="0" distB="0" distL="0" distR="0" wp14:anchorId="7B64E863" wp14:editId="5E203566">
+                <wp:extent cx="304800" cy="304800"/>
+                <wp:effectExtent l="0" t="0" r="0" b="0"/>
+                <wp:docPr id="723852781" name="Rectangle 6"/>
+                <wp:cNvGraphicFramePr>
+                  <a:graphicFrameLocks xmlns:a="http://schemas.openxmlformats.org/drawingml/2006/main" noChangeAspect="1"/>
+                </wp:cNvGraphicFramePr>
+                <a:graphic xmlns:a="http://schemas.openxmlformats.org/drawingml/2006/main">
+                  <a:graphicData uri="http://schemas.microsoft.com/office/word/2010/wordprocessingShape">
+                    <wps:wsp>
+                      <wps:cNvSpPr>
+                        <a:spLocks noChangeAspect="1" noChangeArrowheads="1"/>
+                      </wps:cNvSpPr>
+                      <wps:spPr bwMode="auto">
+                        <a:xfrm>
+                          <a:off x="0" y="0"/>
+                          <a:ext cx="304800" cy="304800"/>
+                        </a:xfrm>
+                        <a:prstGeom prst="rect">
+                          <a:avLst/>
+                        </a:prstGeom>
+                        <a:noFill/>
+                        <a:ln>
+                          <a:noFill/>
+                        </a:ln>
+                        <a:extLst>
+                          <a:ext uri="{909E8E84-426E-40DD-AFC4-6F175D3DCCD1}">
+                            <a14:hiddenFill xmlns:a14="http://schemas.microsoft.com/office/drawing/2010/main">
+                              <a:solidFill>
+                                <a:srgbClr val="FFFFFF"/>
+                              </a:solidFill>
+                            </a14:hiddenFill>
+                          </a:ext>
+                          <a:ext uri="{91240B29-F687-4F45-9708-019B960494DF}">
+                            <a14:hiddenLine xmlns:a14="http://schemas.microsoft.com/office/drawing/2010/main" w="9525">
+                              <a:solidFill>
+                                <a:srgbClr val="000000"/>
+                              </a:solidFill>
+                              <a:miter lim="800000"/>
+                              <a:headEnd/>
+                              <a:tailEnd/>
+                            </a14:hiddenLine>
+                          </a:ext>
+                        </a:extLst>
+                      </wps:spPr>
+                      <wps:bodyPr rot="0" vert="horz" wrap="square" lIns="91440" tIns="45720" rIns="91440" bIns="45720" anchor="t" anchorCtr="0" upright="1">
+                        <a:noAutofit/>
+                      </wps:bodyPr>
+                    </wps:wsp>
+                  </a:graphicData>
+                </a:graphic>
+              </wp:inline>
+            </w:drawing>
+          </mc:Choice>
+          <mc:Fallback>
+            <w:pict>
+              <v:rect w14:anchorId="036406FC" id="Rectangle 6" o:spid="_x0000_s1026" style="width:24pt;height:24pt;visibility:visible;mso-wrap-style:square;mso-left-percent:-10001;mso-top-percent:-10001;mso-position-horizontal:absolute;mso-position-horizontal-relative:char;mso-position-vertical:absolute;mso-position-vertical-relative:line;mso-left-percent:-10001;mso-top-percent:-10001;v-text-anchor:top" o:gfxdata="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" filled="f" stroked="f">
+                <o:lock v:ext="edit" aspectratio="t"/>
+                <w10:anchorlock/>
+              </v:rect>
+            </w:pict>
+          </mc:Fallback>
+        </mc:AlternateContent>
+      </w:r>
+    </w:p>
+    <w:p>
+      <w:r>
+        <w:t>admissions@vainateya.edu</w:t>
+      </w:r>
+    </w:p>
     <w:p/>
     <w:sectPr>
       <w:pgSz w:w="11906" w:h="16838"/>
@@ -717,6 +1313,163 @@
     </w:sectPr>
   </w:body>
 </w:document>
+</file>
+
+<file path=word/numbering.xml><?xml version="1.0" encoding="utf-8"?>
+<w:numbering xmlns:wpc="http://schemas.microsoft.com/office/word/2010/wordprocessingCanvas" xmlns:cx="http://schemas.microsoft.com/office/drawing/2014/chartex" xmlns:cx1="http://schemas.microsoft.com/office/drawing/2015/9/8/chartex" xmlns:cx2="http://schemas.microsoft.com/office/drawing/2015/10/21/chartex" xmlns:cx3="http://schemas.microsoft.com/office/drawing/2016/5/9/chartex" xmlns:cx4="http://schemas.microsoft.com/office/drawing/2016/5/10/chartex" xmlns:cx5="http://schemas.microsoft.com/office/drawing/2016/5/11/chartex" xmlns:cx6="http://schemas.microsoft.com/office/drawing/2016/5/12/chartex" xmlns:cx7="http://schemas.microsoft.com/office/drawing/2016/5/13/chartex" xmlns:cx8="http://schemas.microsoft.com/office/drawing/2016/5/14/chartex" xmlns:mc="http://schemas.openxmlformats.org/markup-compatibility/2006" xmlns:aink="http://schemas.microsoft.com/office/drawing/2016/ink" xmlns:am3d="http://schemas.microsoft.com/office/drawing/2017/model3d" xmlns:o="urn:schemas-microsoft-com:office:office" xmlns:oel="http://schemas.microsoft.com/office/2019/extlst" xmlns:r="http://schemas.openxmlformats.org/officeDocument/2006/relationships" xmlns:m="http://schemas.openxmlformats.org/officeDocument/2006/math" xmlns:v="urn:schemas-microsoft-com:vml" xmlns:wp14="http://schemas.microsoft.com/office/word/2010/wordprocessingDrawing" xmlns:wp="http://schemas.openxmlformats.org/drawingml/2006/wordprocessingDrawing" xmlns:w10="urn:schemas-microsoft-com:office:word" xmlns:w="http://schemas.openxmlformats.org/wordprocessingml/2006/main" xmlns:w14="http://schemas.microsoft.com/office/word/2010/wordml" xmlns:w15="http://schemas.microsoft.com/office/word/2012/wordml" xmlns:w16cex="http://schemas.microsoft.com/office/word/2018/wordml/cex" xmlns:w16cid="http://schemas.microsoft.com/office/word/2016/wordml/cid" xmlns:w16="http://schemas.microsoft.com/office/word/2018/wordml" xmlns:w16du="http://schemas.microsoft.com/office/word/2023/wordml/word16du" xmlns:w16sdtdh="http://schemas.microsoft.com/office/word/2020/wordml/sdtdatahash" xmlns:w16sdtfl="http://schemas.microsoft.com/office/word/2024/wordml/sdtformatlock" xmlns:w16se="http://schemas.microsoft.com/office/word/2015/wordml/symex" xmlns:wpg="http://schemas.microsoft.com/office/word/2010/wordprocessingGroup" xmlns:wpi="http://schemas.microsoft.com/office/word/2010/wordprocessingInk" xmlns:wne="http://schemas.microsoft.com/office/word/2006/wordml" xmlns:wps="http://schemas.microsoft.com/office/word/2010/wordprocessingShape" mc:Ignorable="w14 w15 w16se w16cid w16 w16cex w16sdtdh w16sdtfl w16du wp14">
+  <w:abstractNum w:abstractNumId="0" w15:restartNumberingAfterBreak="0">
+    <w:nsid w:val="35F9526D"/>
+    <w:multiLevelType w:val="multilevel"/>
+    <w:tmpl w:val="E782E3D4"/>
+    <w:lvl w:ilvl="0">
+      <w:start w:val="1"/>
+      <w:numFmt w:val="bullet"/>
+      <w:lvlText w:val=""/>
+      <w:lvlJc w:val="left"/>
+      <w:pPr>
+        <w:tabs>
+          <w:tab w:val="num" w:pos="720"/>
+        </w:tabs>
+        <w:ind w:left="720" w:hanging="360"/>
+      </w:pPr>
+      <w:rPr>
+        <w:rFonts w:ascii="Symbol" w:hAnsi="Symbol" w:hint="default"/>
+        <w:sz w:val="20"/>
+      </w:rPr>
+    </w:lvl>
+    <w:lvl w:ilvl="1" w:tentative="1">
+      <w:start w:val="1"/>
+      <w:numFmt w:val="bullet"/>
+      <w:lvlText w:val=""/>
+      <w:lvlJc w:val="left"/>
+      <w:pPr>
+        <w:tabs>
+          <w:tab w:val="num" w:pos="1440"/>
+        </w:tabs>
+        <w:ind w:left="1440" w:hanging="360"/>
+      </w:pPr>
+      <w:rPr>
+        <w:rFonts w:ascii="Symbol" w:hAnsi="Symbol" w:hint="default"/>
+        <w:sz w:val="20"/>
+      </w:rPr>
+    </w:lvl>
+    <w:lvl w:ilvl="2" w:tentative="1">
+      <w:start w:val="1"/>
+      <w:numFmt w:val="bullet"/>
+      <w:lvlText w:val=""/>
+      <w:lvlJc w:val="left"/>
+      <w:pPr>
+        <w:tabs>
+          <w:tab w:val="num" w:pos="2160"/>
+        </w:tabs>
+        <w:ind w:left="2160" w:hanging="360"/>
+      </w:pPr>
+      <w:rPr>
+        <w:rFonts w:ascii="Symbol" w:hAnsi="Symbol" w:hint="default"/>
+        <w:sz w:val="20"/>
+      </w:rPr>
+    </w:lvl>
+    <w:lvl w:ilvl="3" w:tentative="1">
+      <w:start w:val="1"/>
+      <w:numFmt w:val="bullet"/>
+      <w:lvlText w:val=""/>
+      <w:lvlJc w:val="left"/>
+      <w:pPr>
+        <w:tabs>
+          <w:tab w:val="num" w:pos="2880"/>
+        </w:tabs>
+        <w:ind w:left="2880" w:hanging="360"/>
+      </w:pPr>
+      <w:rPr>
+        <w:rFonts w:ascii="Symbol" w:hAnsi="Symbol" w:hint="default"/>
+        <w:sz w:val="20"/>
+      </w:rPr>
+    </w:lvl>
+    <w:lvl w:ilvl="4" w:tentative="1">
+      <w:start w:val="1"/>
+      <w:numFmt w:val="bullet"/>
+      <w:lvlText w:val=""/>
+      <w:lvlJc w:val="left"/>
+      <w:pPr>
+        <w:tabs>
+          <w:tab w:val="num" w:pos="3600"/>
+        </w:tabs>
+        <w:ind w:left="3600" w:hanging="360"/>
+      </w:pPr>
+      <w:rPr>
+        <w:rFonts w:ascii="Symbol" w:hAnsi="Symbol" w:hint="default"/>
+        <w:sz w:val="20"/>
+      </w:rPr>
+    </w:lvl>
+    <w:lvl w:ilvl="5" w:tentative="1">
+      <w:start w:val="1"/>
+      <w:numFmt w:val="bullet"/>
+      <w:lvlText w:val=""/>
+      <w:lvlJc w:val="left"/>
+      <w:pPr>
+        <w:tabs>
+          <w:tab w:val="num" w:pos="4320"/>
+        </w:tabs>
+        <w:ind w:left="4320" w:hanging="360"/>
+      </w:pPr>
+      <w:rPr>
+        <w:rFonts w:ascii="Symbol" w:hAnsi="Symbol" w:hint="default"/>
+        <w:sz w:val="20"/>
+      </w:rPr>
+    </w:lvl>
+    <w:lvl w:ilvl="6" w:tentative="1">
+      <w:start w:val="1"/>
+      <w:numFmt w:val="bullet"/>
+      <w:lvlText w:val=""/>
+      <w:lvlJc w:val="left"/>
+      <w:pPr>
+        <w:tabs>
+          <w:tab w:val="num" w:pos="5040"/>
+        </w:tabs>
+        <w:ind w:left="5040" w:hanging="360"/>
+      </w:pPr>
+      <w:rPr>
+        <w:rFonts w:ascii="Symbol" w:hAnsi="Symbol" w:hint="default"/>
+        <w:sz w:val="20"/>
+      </w:rPr>
+    </w:lvl>
+    <w:lvl w:ilvl="7" w:tentative="1">
+      <w:start w:val="1"/>
+      <w:numFmt w:val="bullet"/>
+      <w:lvlText w:val=""/>
+      <w:lvlJc w:val="left"/>
+      <w:pPr>
+        <w:tabs>
+          <w:tab w:val="num" w:pos="5760"/>
+        </w:tabs>
+        <w:ind w:left="5760" w:hanging="360"/>
+      </w:pPr>
+      <w:rPr>
+        <w:rFonts w:ascii="Symbol" w:hAnsi="Symbol" w:hint="default"/>
+        <w:sz w:val="20"/>
+      </w:rPr>
+    </w:lvl>
+    <w:lvl w:ilvl="8" w:tentative="1">
+      <w:start w:val="1"/>
+      <w:numFmt w:val="bullet"/>
+      <w:lvlText w:val=""/>
+      <w:lvlJc w:val="left"/>
+      <w:pPr>
+        <w:tabs>
+          <w:tab w:val="num" w:pos="6480"/>
+        </w:tabs>
+        <w:ind w:left="6480" w:hanging="360"/>
+      </w:pPr>
+      <w:rPr>
+        <w:rFonts w:ascii="Symbol" w:hAnsi="Symbol" w:hint="default"/>
+        <w:sz w:val="20"/>
+      </w:rPr>
+    </w:lvl>
+  </w:abstractNum>
+  <w:num w:numId="1" w16cid:durableId="1555004689">
+    <w:abstractNumId w:val="0"/>
+  </w:num>
+</w:numbering>
 </file>
 
 <file path=word/styles.xml><?xml version="1.0" encoding="utf-8"?>

</xml_diff>